<commit_message>
Adding more pagination fixes, and table management improvements. Updating gitignore
</commit_message>
<xml_diff>
--- a/characters/Escama Roja/EscamaRoja.docx
+++ b/characters/Escama Roja/EscamaRoja.docx
@@ -855,6 +855,67 @@
             <w:r>
               <w:rPr/>
               <w:t>(sleight of hand and stealth)</w:t>
+            </w:r>
+          </w:p>
+        </w:tc>
+      </w:tr>
+      <w:tr>
+        <w:trPr/>
+        <w:tc>
+          <w:tcPr>
+            <w:tcW w:w="4514" w:type="dxa"/>
+            <w:tcBorders>
+              <w:left w:val="single" w:sz="8" w:space="0" w:color="000000"/>
+              <w:bottom w:val="single" w:sz="8" w:space="0" w:color="000000"/>
+              <w:right w:val="single" w:sz="8" w:space="0" w:color="000000"/>
+            </w:tcBorders>
+            <w:shd w:fill="auto" w:val="clear"/>
+          </w:tcPr>
+          <w:p>
+            <w:pPr>
+              <w:pStyle w:val="normal1"/>
+              <w:keepNext w:val="false"/>
+              <w:keepLines w:val="false"/>
+              <w:widowControl w:val="false"/>
+              <w:pBdr/>
+              <w:shd w:val="clear" w:fill="auto"/>
+              <w:spacing w:lineRule="auto" w:line="240" w:before="0" w:after="0"/>
+              <w:ind w:hanging="0" w:left="0" w:right="0"/>
+              <w:jc w:val="left"/>
+              <w:rPr/>
+            </w:pPr>
+            <w:r>
+              <w:rPr/>
+              <w:t>Ilustration</w:t>
+            </w:r>
+          </w:p>
+        </w:tc>
+        <w:tc>
+          <w:tcPr>
+            <w:tcW w:w="4514" w:type="dxa"/>
+            <w:tcBorders>
+              <w:left w:val="single" w:sz="8" w:space="0" w:color="000000"/>
+              <w:bottom w:val="single" w:sz="8" w:space="0" w:color="000000"/>
+              <w:right w:val="single" w:sz="8" w:space="0" w:color="000000"/>
+            </w:tcBorders>
+            <w:shd w:fill="auto" w:val="clear"/>
+          </w:tcPr>
+          <w:p>
+            <w:pPr>
+              <w:pStyle w:val="normal1"/>
+              <w:keepNext w:val="false"/>
+              <w:keepLines w:val="false"/>
+              <w:widowControl w:val="false"/>
+              <w:pBdr/>
+              <w:shd w:val="clear" w:fill="auto"/>
+              <w:spacing w:lineRule="auto" w:line="240" w:before="0" w:after="0"/>
+              <w:ind w:hanging="0" w:left="0" w:right="0"/>
+              <w:jc w:val="left"/>
+              <w:rPr/>
+            </w:pPr>
+            <w:r>
+              <w:rPr/>
+              <w:t>assets/EscamaRoja.png</w:t>
             </w:r>
           </w:p>
         </w:tc>

</xml_diff>